<commit_message>
update: WEEK 4 EXERCISE PROGRAM
</commit_message>
<xml_diff>
--- a/WEEK 4/26MML0031_WEEK_4_PRACTICE_PROGRAM.docx
+++ b/WEEK 4/26MML0031_WEEK_4_PRACTICE_PROGRAM.docx
@@ -4560,7 +4560,23 @@
           </w:p>
           <w:p>
             <w:r>
-              <w:t>4</w:t>
+              <w:t>4. Python Program (</w:t>
+            </w:r>
+            <w:hyperlink r:id="rId14" w:history="1">
+              <w:r>
+                <w:rPr>
+                  <w:rStyle w:val="Hyperlink"/>
+                </w:rPr>
+                <w:t>https://github.com/hasnainmakada-99/Data-Science-Codes/blob/main/WEEK%204/PRACTICE_PROGRAM.py</w:t>
+              </w:r>
+            </w:hyperlink>
+            <w:r>
+              <w:t xml:space="preserve">) </w:t>
+            </w:r>
+          </w:p>
+          <w:p>
+            <w:r>
+              <w:t>5</w:t>
             </w:r>
             <w:r>
               <w:t>. Programming for Data Science (MACSE502) class lecture notes</w:t>
@@ -4568,7 +4584,7 @@
             <w:r>
               <w:t xml:space="preserve"> (</w:t>
             </w:r>
-            <w:hyperlink r:id="rId14" w:history="1">
+            <w:hyperlink r:id="rId15" w:history="1">
               <w:r>
                 <w:rPr>
                   <w:rStyle w:val="Hyperlink"/>
@@ -4608,8 +4624,8 @@
       </w:r>
     </w:p>
     <w:sectPr>
-      <w:headerReference w:type="default" r:id="rId15"/>
-      <w:footerReference w:type="default" r:id="rId16"/>
+      <w:headerReference w:type="default" r:id="rId16"/>
+      <w:footerReference w:type="default" r:id="rId17"/>
       <w:pgSz w:w="11906" w:h="16838"/>
       <w:pgMar w:top="1440" w:right="1440" w:bottom="1440" w:left="1440" w:header="708" w:footer="708" w:gutter="0"/>
       <w:pgBorders w:offsetFrom="page">

</xml_diff>